<commit_message>
B4 and B6: final corrections on the 24 September runs
B4 re-priced on the revised framework's blended conversion rate (group
rate standing in for the child's) and a corrected group CVR roll-up.
B6 re-validated on run 20260924-981b2555 (focus Queen, Full, King,
Cooling): push inside the loss stop, engine-plan envelope and TACoS
guard; out-of-focus test with the flagship held; freezes on the 7-day
median; rows that should not load; Part D rebuilt for B6.

Co-Authored-By: Claude Opus 5.5 <noreply@anthropic.com>
Claude-Session: https://claude.ai/code/session_01FvXHKtbYmE3ru99HYV2muV
</commit_message>
<xml_diff>
--- a/docs/DBS4_Corrections_by_Situation_20260924-5e8a0f10.docx
+++ b/docs/DBS4_Corrections_by_Situation_20260924-5e8a0f10.docx
@@ -963,7 +963,7 @@
           <w:b w:val="0"/>
           <w:i w:val="0"/>
         </w:rPr>
-        <w:t>Five things, each written on the row. (1) The loss stop: the top-of-search price may not pass the point where a top-of-search order costs more than 3× contribution — 3 × contribution (the advertised child’s at today’s price; $27.59 on average across these rows) × the campaign’s top-of-search conversion rate (its own when it has 15 or more top-of-search clicks in 90 days; under 15, the product’s average across all exact ranking campaigns, 15.0%). A campaign whose own 15+ clicks have produced no top-of-search order takes no step until it converts. Every pushed row carries its cost and loss per order at the new price. (2) The share stop: impression share at 40% or more and not rising after the last step — the requirement is overstated, not the price; it is re-based from actual volume. (3) The reachability check: delivered clicks ÷ impression share is what winning the whole auction would buy; where the requirement is above that — true of most California King rows — the campaign is pushed toward share and graded on share and 7-day rank, not on an unbuyable click count. (4) The envelope (below). (5) The product guard: if weekly TACoS passes 21.7% — the run’s own projection, 1.2× the 18% ceiling of the ranking band — no new step is written and every row holds at its last price until it is back under (operator 2026-09-25). The deal week ran 19.4%.</w:t>
+        <w:t>Five things, each written on the row. (1) The loss stop: the top-of-search price may not pass the point where a top-of-search order costs more than 3× contribution — 3 × contribution (the advertised child’s at today’s price; $27.59 on average across these rows) × the campaign’s top-of-search conversion rate, set as the framework (25 September version) sets it: under 15 top-of-search clicks in 90 days, the child’s planning rate; 15–49 clicks with at least one order, a blend weighted by clicks ((clicks − 15) ÷ 35 on the campaign’s own rate); 15–49 with no order yet, the child’s rate — no evidence is not evidence of zero; 50 or more, the campaign’s own rate, and there a rate of zero sets the ceiling to zero and top of search stops being priced. No child-level planning rate exists on this account (the run says so), so the rate of the campaign’s syntax group across all enabled exact ranking campaigns stands in for it (the product’s, 15.0%, where the group has under 50 clicks). Every pushed row carries its cost and loss per order at the new price. (2) The share stop: impression share at 40% or more and not rising after the last step — the requirement is overstated, not the price; it is re-based from actual volume. (3) The reachability check: delivered clicks ÷ impression share is what winning the whole auction would buy; where the requirement is above that — true of most California King rows — the campaign is pushed toward share and graded on share and 7-day rank, not on an unbuyable click count. (4) The envelope (below). (5) The product guard: if weekly TACoS passes 21.7% — the run’s own projection, 1.2× the 18% ceiling of the ranking band — no new step is written and every row holds at its last price until it is back under (operator 2026-09-25). The deal week ran 19.4%.</w:t>
       </w:r>
     </w:p>
     <w:p>
@@ -1269,7 +1269,7 @@
                 <w:i w:val="0"/>
                 <w:sz w:val="15"/>
               </w:rPr>
-              <w:t>9</w:t>
+              <w:t>10</w:t>
             </w:r>
           </w:p>
         </w:tc>
@@ -1285,7 +1285,7 @@
                 <w:i w:val="0"/>
                 <w:sz w:val="15"/>
               </w:rPr>
-              <w:t>5</w:t>
+              <w:t>4</w:t>
             </w:r>
           </w:p>
         </w:tc>
@@ -1301,7 +1301,7 @@
                 <w:i w:val="0"/>
                 <w:sz w:val="15"/>
               </w:rPr>
-              <w:t>2</w:t>
+              <w:t>3</w:t>
             </w:r>
           </w:p>
         </w:tc>
@@ -1333,7 +1333,7 @@
                 <w:i w:val="0"/>
                 <w:sz w:val="15"/>
               </w:rPr>
-              <w:t>$21</w:t>
+              <w:t>$44</w:t>
             </w:r>
           </w:p>
         </w:tc>
@@ -1470,7 +1470,7 @@
                 <w:i w:val="0"/>
                 <w:sz w:val="15"/>
               </w:rPr>
-              <w:t>$10</w:t>
+              <w:t>$40</w:t>
             </w:r>
           </w:p>
         </w:tc>
@@ -1537,13 +1537,29 @@
                 <w:i w:val="0"/>
                 <w:sz w:val="15"/>
               </w:rPr>
+              <w:t>0</w:t>
+            </w:r>
+          </w:p>
+        </w:tc>
+        <w:tc>
+          <w:tcPr>
+            <w:tcW w:type="dxa" w:w="850"/>
+          </w:tcPr>
+          <w:p>
+            <w:r/>
+            <w:r>
+              <w:rPr>
+                <w:b w:val="0"/>
+                <w:i w:val="0"/>
+                <w:sz w:val="15"/>
+              </w:rPr>
               <w:t>1</w:t>
             </w:r>
           </w:p>
         </w:tc>
         <w:tc>
           <w:tcPr>
-            <w:tcW w:type="dxa" w:w="850"/>
+            <w:tcW w:type="dxa" w:w="794"/>
           </w:tcPr>
           <w:p>
             <w:r/>
@@ -1553,13 +1569,13 @@
                 <w:i w:val="0"/>
                 <w:sz w:val="15"/>
               </w:rPr>
-              <w:t>0</w:t>
-            </w:r>
-          </w:p>
-        </w:tc>
-        <w:tc>
-          <w:tcPr>
-            <w:tcW w:type="dxa" w:w="794"/>
+              <w:t>1</w:t>
+            </w:r>
+          </w:p>
+        </w:tc>
+        <w:tc>
+          <w:tcPr>
+            <w:tcW w:type="dxa" w:w="1247"/>
           </w:tcPr>
           <w:p>
             <w:r/>
@@ -1575,7 +1591,7 @@
         </w:tc>
         <w:tc>
           <w:tcPr>
-            <w:tcW w:type="dxa" w:w="1247"/>
+            <w:tcW w:type="dxa" w:w="1134"/>
           </w:tcPr>
           <w:p>
             <w:r/>
@@ -1585,23 +1601,7 @@
                 <w:i w:val="0"/>
                 <w:sz w:val="15"/>
               </w:rPr>
-              <w:t>1</w:t>
-            </w:r>
-          </w:p>
-        </w:tc>
-        <w:tc>
-          <w:tcPr>
-            <w:tcW w:type="dxa" w:w="1134"/>
-          </w:tcPr>
-          <w:p>
-            <w:r/>
-            <w:r>
-              <w:rPr>
-                <w:b w:val="0"/>
-                <w:i w:val="0"/>
-                <w:sz w:val="15"/>
-              </w:rPr>
-              <w:t>—</w:t>
+              <w:t>$94</w:t>
             </w:r>
           </w:p>
         </w:tc>
@@ -1672,7 +1672,7 @@
           <w:b w:val="0"/>
           <w:i w:val="0"/>
         </w:rPr>
-        <w:t xml:space="preserve"> for 09-25 → 09-28 (operator 2026-09-25). At the new prices with clicks unchanged these campaigns would spend about $84 a day; the rest is room for the clicks the push buys. Rows keep stepping daily while impression share rises, inside the loss stop and the TACoS guard, until the envelope is spent. Buying every in-focus requirement at the new prices would cost about $754 a day — more than the auction holds on most of these terms (reachability), which is why share, not clicks, is the grade.</w:t>
+        <w:t xml:space="preserve"> for 09-25 → 09-28 (operator 2026-09-25). At the new prices with clicks unchanged these campaigns would spend about $83 a day; the rest is room for the clicks the push buys. Rows keep stepping daily while impression share rises, inside the loss stop and the TACoS guard, until the envelope is spent. Buying every in-focus requirement at the new prices would cost about $742 a day — more than the auction holds on most of these terms (reachability), which is why share, not clicks, is the grade.</w:t>
       </w:r>
     </w:p>
     <w:p>
@@ -1751,7 +1751,7 @@
           <w:b w:val="0"/>
           <w:i w:val="0"/>
         </w:rPr>
-        <w:t xml:space="preserve"> — no rank on file. 90 days: 26 clicks — 23 top of search, 0 product pages, 3 rest of search (88% / 0% / 12%), 7 orders. Last 14 days: 12 clicks — 11 top of search, 0 product pages, 1 rest of search (92% / 0% / 8%). Deal so far (09-15 → 09-24): 6 top-of-search clicks (0.6/day, against 0.5/day in the 31 days before); last 3 days 1 clicks. Plan needs 45 paid clicks a week (6.4/day). Budget $17.97/day, last 7 days 24% used. Top of search converts 18.3% against a market 2.5% for Bamboo|Cooling (bar 7.5%). The run writes budget $17.97 → $23.36. Correction: +30% (25% of required top-of-search clicks delivered → +30%) — TOS $9.76 → $12.69; a top-of-search order then costs up to $49 (a loss of $22 against $27.01 contribution; stop at $21.14); impression share 21.9% (30 days) → 24.9% (deal so far); the requirement is above what the whole auction holds — grade on share; modifier 433%.</w:t>
+        <w:t xml:space="preserve"> — no rank on file. 90 days: 26 clicks — 23 top of search, 0 product pages, 3 rest of search (88% / 0% / 12%), 7 orders. Last 14 days: 12 clicks — 11 top of search, 0 product pages, 1 rest of search (92% / 0% / 8%). Deal so far (09-15 → 09-24): 6 top-of-search clicks (0.6/day, against 0.5/day in the 31 days before); last 3 days 1 clicks. Plan needs 45 paid clicks a week (6.4/day). Budget $17.97/day, last 7 days 24% used. Top of search converts 18.3% against a market 2.5% for Bamboo|Cooling (bar 7.5%). The run writes budget $17.97 → $23.36. Correction: +30% (25% of required top-of-search clicks delivered → +30%) — TOS $9.76 → $12.69; a top-of-search order then costs up to $66 (a loss of $39 against $27.01 contribution; stop at $15.68); impression share 21.9% (30 days) → 24.9% (deal so far); the requirement is above what the whole auction holds — grade on share; modifier 433%.</w:t>
       </w:r>
     </w:p>
     <w:p>
@@ -1770,7 +1770,7 @@
           <w:b w:val="0"/>
           <w:i w:val="0"/>
         </w:rPr>
-        <w:t xml:space="preserve"> — no rank on file. 90 days: 15 clicks — 14 top of search, 0 product pages, 1 rest of search (93% / 0% / 7%), 2 orders. Last 14 days: 9 clicks — 9 top of search, 0 product pages, 0 rest of search (100% / 0% / 0%). Deal so far (09-15 → 09-24): 5 top-of-search clicks (0.5/day, against 0.3/day in the 31 days before); last 3 days 2 clicks. Budget $10.00/day, last 7 days 29% used. Top of search converts 16.0% against a market 2.5% for Bamboo|Cooling (bar 7.5%). The run holds it. Correction: +20% (no click requirement on file → +20% (a stated departure: the logic document would hold at the ceiling); stopped at the loss stop 12.12) — TOS $10.41 → $12.12; a top-of-search order then costs up to $81 (a loss of $54 against $27.01 contribution; stop at $12.12); impression share 26.6% (30 days) → 32.3% (deal so far); modifier 304%.</w:t>
+        <w:t xml:space="preserve"> — no rank on file. 90 days: 15 clicks — 14 top of search, 0 product pages, 1 rest of search (93% / 0% / 7%), 2 orders. Last 14 days: 9 clicks — 9 top of search, 0 product pages, 0 rest of search (100% / 0% / 0%). Deal so far (09-15 → 09-24): 5 top-of-search clicks (0.5/day, against 0.3/day in the 31 days before); last 3 days 2 clicks. Budget $10.00/day, last 7 days 29% used. Top of search converts 16.0% against a market 2.5% for Bamboo|Cooling (bar 7.5%). The run holds it. Correction: +20% (no click requirement on file → +20% (a stated departure: the logic document would hold at the ceiling); stopped at the loss stop 11.53) — TOS $10.41 → $11.53; a top-of-search order then costs up to $81 (a loss of $54 against $27.01 contribution; stop at $11.53); impression share 26.6% (30 days) → 32.3% (deal so far); modifier 284%.</w:t>
       </w:r>
     </w:p>
     <w:p>
@@ -1789,7 +1789,7 @@
           <w:b w:val="0"/>
           <w:i w:val="0"/>
         </w:rPr>
-        <w:t xml:space="preserve"> — rank 8 → 7 in thirty days, target 5. 90 days: 11 clicks — 9 top of search, 2 product pages, 0 rest of search (82% / 18% / 0%), 0 orders. Last 14 days: 11 clicks — 9 top of search, 2 product pages, 0 rest of search (82% / 18% / 0%). Deal so far (09-15 → 09-24): 6 top-of-search clicks (0.6/day, against 0.1/day in the 31 days before); last 3 days 2 clicks. Plan needs 40 paid clicks a week (5.7/day). Budget $22.07/day, last 7 days 23% used. Top of search converts 13.5% against a market 2.9% for Bamboo|California King (bar 8.8%). The run holds it. Correction: +30% (20% of required top-of-search clicks delivered → +30%; stopped at the loss stop 12.96) — TOS $10.35 → $12.96; a top-of-search order then costs up to $87 (a loss of $58 against $28.88 contribution; stop at $12.96); impression share 15.2% (30 days) → 20.1% (deal so far); the requirement is above what the whole auction holds — grade on share; modifier 319%.</w:t>
+        <w:t xml:space="preserve"> — rank 8 → 7 in thirty days, target 5. 90 days: 11 clicks — 9 top of search, 2 product pages, 0 rest of search (82% / 18% / 0%), 0 orders. Last 14 days: 11 clicks — 9 top of search, 2 product pages, 0 rest of search (82% / 18% / 0%). Deal so far (09-15 → 09-24): 6 top-of-search clicks (0.6/day, against 0.1/day in the 31 days before); last 3 days 2 clicks. Plan needs 40 paid clicks a week (5.7/day). Budget $22.07/day, last 7 days 23% used. Top of search converts 13.5% against a market 2.9% for Bamboo|California King (bar 8.8%). The run holds it. Correction: no step (loss stop reached — at 10.35 a top-of-search order already costs 123 (stop 3× contribution = 87)) — TOS $10.35 → $10.35; a top-of-search order then costs up to $123 (a loss of $94 against $28.88 contribution; stop at $7.31); impression share 15.2% (30 days) → 20.1% (deal so far); the requirement is above what the whole auction holds — grade on share; modifier 235%.</w:t>
       </w:r>
     </w:p>
     <w:p>
@@ -1976,7 +1976,7 @@
           <w:b w:val="0"/>
           <w:i w:val="0"/>
         </w:rPr>
-        <w:t xml:space="preserve"> — rank 33 → 35 in thirty days, target 3. 90 days: 54 clicks — 39 top of search, 4 product pages, 11 rest of search (72% / 7% / 20%), 7 orders. Last 14 days: no clicks. Deal so far (09-15 → 09-24): 0 top-of-search clicks (0.0/day, against 0.1/day in the 31 days before); last 3 days 0 clicks. Plan needs 40 paid clicks a week (5.7/day). Budget $9.94/day, last 7 days 0% used. Top of search converts 17.3% against a market 2.5% for Bamboo|Cooling (bar 7.5%). The run writes modifier 69% → 119% — top-of-search price $1.67 → $2.17. Correction: +30% (0% of required top-of-search clicks delivered → +30%) — TOS $1.67 → $2.18; a top-of-search order then costs up to $12 (still a profit of $14 against $26.58 contribution; stop at $14.31); modifier 120%; the 10 September round changed it (top-of-search modifier 0% → 30%) — read it the day after the push.</w:t>
+        <w:t xml:space="preserve"> — rank 33 → 35 in thirty days, target 3. 90 days: 54 clicks — 39 top of search, 4 product pages, 11 rest of search (72% / 7% / 20%), 7 orders. Last 14 days: no clicks. Deal so far (09-15 → 09-24): 0 top-of-search clicks (0.0/day, against 0.1/day in the 31 days before); last 3 days 0 clicks. Plan needs 40 paid clicks a week (5.7/day). Budget $9.94/day, last 7 days 0% used. Top of search converts 17.3% against a market 2.5% for Bamboo|Cooling (bar 7.5%). The run writes modifier 69% → 119% — top-of-search price $1.67 → $2.17. Correction: +30% (0% of required top-of-search clicks delivered → +30%) — TOS $1.67 → $2.18; a top-of-search order then costs up to $13 (still a profit of $14 against $26.58 contribution; stop at $13.38); modifier 120%; the 10 September round changed it (top-of-search modifier 0% → 30%) — read it the day after the push.</w:t>
       </w:r>
     </w:p>
     <w:p>
@@ -1995,7 +1995,7 @@
           <w:b w:val="0"/>
           <w:i w:val="0"/>
         </w:rPr>
-        <w:t xml:space="preserve"> — rank 7 → 9 in thirty days, target 1. 90 days: 57 clicks — 24 top of search, 33 product pages, 0 rest of search (42% / 58% / 0%), 7 orders. Last 14 days: 2 clicks — 0 top of search, 2 product pages, 0 rest of search (0% / 100% / 0%). Deal so far (09-15 → 09-24): 0 top-of-search clicks (0.0/day, against 0.1/day in the 31 days before); last 3 days 0 clicks. Plan needs 16 paid clicks a week (2.3/day). Budget $8.23/day, last 7 days 0% used. Top of search converts 12.2% against a market 2.9% for Bamboo|California King (bar 8.8%). The run writes modifier 276% → 422% — top-of-search price $3.84 → $5.32. Correction: +30% (0% of required top-of-search clicks delivered → +30%) — TOS $3.84 → $4.99; a top-of-search order then costs up to $60 (a loss of $32 against $27.58 contribution; stop at $6.89); impression share 0.3% (30 days) → 1.3% (deal so far); modifier 389%; the run’s own write goes further (top of search $3.84 → $5.32, +39% in one write) — step it daily instead, so each step is graded on share; the 10 September round changed it (top-of-search modifier 170% → 182%) — read it the day after the push.</w:t>
+        <w:t xml:space="preserve"> — rank 7 → 9 in thirty days, target 1. 90 days: 57 clicks — 24 top of search, 33 product pages, 0 rest of search (42% / 58% / 0%), 7 orders. Last 14 days: 2 clicks — 0 top of search, 2 product pages, 0 rest of search (0% / 100% / 0%). Deal so far (09-15 → 09-24): 0 top-of-search clicks (0.0/day, against 0.1/day in the 31 days before); last 3 days 0 clicks. Plan needs 16 paid clicks a week (2.3/day). Budget $8.23/day, last 7 days 0% used. Top of search converts 12.2% against a market 2.9% for Bamboo|California King (bar 8.8%). The run writes modifier 276% → 422% — top-of-search price $3.84 → $5.32. Correction: +30% (0% of required top-of-search clicks delivered → +30%) — TOS $3.84 → $4.99; a top-of-search order then costs up to $59 (a loss of $32 against $27.58 contribution; stop at $6.96); impression share 0.3% (30 days) → 1.3% (deal so far); modifier 389%; the run’s own write goes further (top of search $3.84 → $5.32, +39% in one write) — step it daily instead, so each step is graded on share; the 10 September round changed it (top-of-search modifier 170% → 182%) — read it the day after the push.</w:t>
       </w:r>
     </w:p>
     <w:p>
@@ -2079,7 +2079,7 @@
           <w:b w:val="0"/>
           <w:i w:val="0"/>
         </w:rPr>
-        <w:t xml:space="preserve"> — rank 23 → 37 in thirty days, target 4. 90 days: 5 clicks — 5 top of search, 0 product pages, 0 rest of search (100% / 0% / 0%), 2 orders. Last 14 days: 5 clicks — 5 top of search, 0 product pages, 0 rest of search (100% / 0% / 0%). Deal so far (09-15 → 09-24): 5 top-of-search clicks (0.5/day, against 0.0/day in the 31 days before); last 3 days 1 clicks. Plan needs 40 paid clicks a week (5.7/day). Budget $5.00/day, last 7 days 49% used. Top of search converts 13.5% against a market 2.9% for Bamboo|California King (bar 8.8%). The run writes modifier 320% → 372% — top-of-search price $5.71 → $6.42. Correction: +30% (12% of required top-of-search clicks delivered → +30%) — TOS $5.71 → $7.43; a top-of-search order then costs up to $50 (a loss of $21 against $28.88 contribution; stop at $12.96); impression share 9.5% (30 days) → 12.4% (deal so far); the requirement is above what the whole auction holds — grade on share; modifier 446%.</w:t>
+        <w:t xml:space="preserve"> — rank 23 → 37 in thirty days, target 4. 90 days: 5 clicks — 5 top of search, 0 product pages, 0 rest of search (100% / 0% / 0%), 2 orders. Last 14 days: 5 clicks — 5 top of search, 0 product pages, 0 rest of search (100% / 0% / 0%). Deal so far (09-15 → 09-24): 5 top-of-search clicks (0.5/day, against 0.0/day in the 31 days before); last 3 days 1 clicks. Plan needs 40 paid clicks a week (5.7/day). Budget $5.00/day, last 7 days 49% used. Top of search converts 13.5% against a market 2.9% for Bamboo|California King (bar 8.8%). The run writes modifier 320% → 372% — top-of-search price $5.71 → $6.42. Correction: +30% (12% of required top-of-search clicks delivered → +30%; stopped at the loss stop 7.31) — TOS $5.71 → $7.31; a top-of-search order then costs up to $87 (a loss of $58 against $28.88 contribution; stop at $7.31); impression share 9.5% (30 days) → 12.4% (deal so far); the requirement is above what the whole auction holds — grade on share; modifier 437%.</w:t>
       </w:r>
     </w:p>
     <w:p>
@@ -5133,6 +5133,26 @@
           <w:b/>
           <w:i w:val="0"/>
         </w:rPr>
+        <w:t>Price every placement on the framework’s blended rate</w:t>
+      </w:r>
+      <w:r>
+        <w:rPr>
+          <w:b w:val="0"/>
+          <w:i w:val="0"/>
+        </w:rPr>
+        <w:t xml:space="preserve"> — the child’s planning rate under 15 clicks, a click-weighted blend from 15 to 49, the campaign’s own from 50 (zero included). The account has no child planning rate; the group rate stands in, which is why the Cal King rows here price on 8.4% rather than the product’s 15%.</w:t>
+      </w:r>
+    </w:p>
+    <w:p>
+      <w:pPr>
+        <w:pStyle w:val="ListBullet"/>
+        <w:spacing w:after="40"/>
+      </w:pPr>
+      <w:r>
+        <w:rPr>
+          <w:b/>
+          <w:i w:val="0"/>
+        </w:rPr>
         <w:t>Write predictions the step can deliver</w:t>
       </w:r>
       <w:r>
@@ -5382,7 +5402,7 @@
           <w:b w:val="0"/>
           <w:i w:val="0"/>
         </w:rPr>
-        <w:t xml:space="preserve"> At the top of search over 30 days: Bamboo|Cooling CTR 5.2% vs a 2.1% bar and CVR 19.1% vs 7.5%; “bamboo cooling sheets” 3.5% / 19.5% on 54 clicks. Bamboo|California King: CTR high, CVR 10.1% vs an 8.8% bar — but on only 35 top-of-search clicks in 30 days across the whole group, so the call rests on a thin sample.</w:t>
+        <w:t xml:space="preserve"> At the top of search over 30 days: Bamboo|Cooling CTR 5.2% vs a 2.1% bar and CVR 21.4% vs 7.5%; “bamboo cooling sheets” 3.5% / 19.5% on 54 clicks. Bamboo|California King: CTR and CVR both well over the bars (CVR 25.6% vs 8.8%) — but on only 35 top-of-search clicks in 30 days across the whole group, so the call rests on a thin sample.</w:t>
       </w:r>
     </w:p>
     <w:p>
@@ -8000,7 +8020,21 @@
           <w:b w:val="0"/>
           <w:i w:val="0"/>
         </w:rPr>
-        <w:t xml:space="preserve"> — meets both, impression share ≥ 10% → scale while rank moves.</w:t>
+        <w:t xml:space="preserve"> — meets both, impression share ≥ 10% → scale while rank moves. </w:t>
+      </w:r>
+      <w:r>
+        <w:rPr>
+          <w:b/>
+          <w:i w:val="0"/>
+        </w:rPr>
+        <w:t>Meets the bars, share not read</w:t>
+      </w:r>
+      <w:r>
+        <w:rPr>
+          <w:b w:val="0"/>
+          <w:i w:val="0"/>
+        </w:rPr>
+        <w:t xml:space="preserve"> — the group’s CTR and CVR clear the bars but none of its member targets has a share reading (the size groups always).</w:t>
       </w:r>
     </w:p>
     <w:p>
@@ -8288,7 +8322,7 @@
                 <w:i w:val="0"/>
                 <w:sz w:val="14"/>
               </w:rPr>
-              <w:t>13.7 / 8.3</w:t>
+              <w:t>13.9 / 8.3</w:t>
             </w:r>
           </w:p>
         </w:tc>
@@ -8439,7 +8473,7 @@
                 <w:i w:val="0"/>
                 <w:sz w:val="14"/>
               </w:rPr>
-              <w:t>8.5 / 8.7</w:t>
+              <w:t>8.8 / 8.7</w:t>
             </w:r>
           </w:p>
         </w:tc>
@@ -8507,7 +8541,7 @@
                 <w:i w:val="0"/>
                 <w:sz w:val="14"/>
               </w:rPr>
-              <w:t>PERFORMANCE GAP — shown, but CVR under target</w:t>
+              <w:t>MEETS THE BARS — impression share not read</w:t>
             </w:r>
           </w:p>
         </w:tc>
@@ -8589,7 +8623,7 @@
                 <w:i w:val="0"/>
                 <w:sz w:val="14"/>
               </w:rPr>
-              <w:t>14.9 / 10.8</w:t>
+              <w:t>18.8 / 10.8</w:t>
             </w:r>
           </w:p>
         </w:tc>
@@ -8740,7 +8774,7 @@
                 <w:i w:val="0"/>
                 <w:sz w:val="14"/>
               </w:rPr>
-              <w:t>21.9 / 13.3</w:t>
+              <w:t>23.7 / 13.3</w:t>
             </w:r>
           </w:p>
         </w:tc>
@@ -8890,7 +8924,7 @@
                 <w:i w:val="0"/>
                 <w:sz w:val="14"/>
               </w:rPr>
-              <w:t>14.5 / 13.2</w:t>
+              <w:t>19.7 / 13.2</w:t>
             </w:r>
           </w:p>
         </w:tc>
@@ -8954,7 +8988,7 @@
                 <w:i w:val="0"/>
                 <w:sz w:val="14"/>
               </w:rPr>
-              <w:t>ON TRACK</w:t>
+              <w:t>MEETS THE BARS — impression share not read</w:t>
             </w:r>
           </w:p>
         </w:tc>
@@ -9041,7 +9075,7 @@
                 <w:i w:val="0"/>
                 <w:sz w:val="14"/>
               </w:rPr>
-              <w:t>22.6 / 12.1</w:t>
+              <w:t>23.8 / 12.1</w:t>
             </w:r>
           </w:p>
         </w:tc>
@@ -9191,7 +9225,7 @@
                 <w:i w:val="0"/>
                 <w:sz w:val="14"/>
               </w:rPr>
-              <w:t>19.1 / 7.5</w:t>
+              <w:t>21.4 / 7.5</w:t>
             </w:r>
           </w:p>
         </w:tc>
@@ -9342,7 +9376,7 @@
                 <w:i w:val="0"/>
                 <w:sz w:val="14"/>
               </w:rPr>
-              <w:t>17.9 / 10.5</w:t>
+              <w:t>30.8 / 10.5</w:t>
             </w:r>
           </w:p>
         </w:tc>
@@ -9492,7 +9526,7 @@
                 <w:i w:val="0"/>
                 <w:sz w:val="14"/>
               </w:rPr>
-              <w:t>25.3 / 12.2</w:t>
+              <w:t>31.0 / 12.2</w:t>
             </w:r>
           </w:p>
         </w:tc>
@@ -9643,7 +9677,7 @@
                 <w:i w:val="0"/>
                 <w:sz w:val="14"/>
               </w:rPr>
-              <w:t>19.2 / 17.1</w:t>
+              <w:t>21.6 / 17.1</w:t>
             </w:r>
           </w:p>
         </w:tc>
@@ -9711,7 +9745,7 @@
                 <w:i w:val="0"/>
                 <w:sz w:val="14"/>
               </w:rPr>
-              <w:t>ON TRACK</w:t>
+              <w:t>MEETS THE BARS — impression share not read</w:t>
             </w:r>
           </w:p>
         </w:tc>
@@ -9793,7 +9827,7 @@
                 <w:i w:val="0"/>
                 <w:sz w:val="14"/>
               </w:rPr>
-              <w:t>19.9 / 18.3</w:t>
+              <w:t>24.9 / 18.3</w:t>
             </w:r>
           </w:p>
         </w:tc>
@@ -9857,7 +9891,7 @@
                 <w:i w:val="0"/>
                 <w:sz w:val="14"/>
               </w:rPr>
-              <w:t>ON TRACK</w:t>
+              <w:t>MEETS THE BARS — impression share not read</w:t>
             </w:r>
           </w:p>
         </w:tc>
@@ -9944,7 +9978,7 @@
                 <w:i w:val="0"/>
                 <w:sz w:val="14"/>
               </w:rPr>
-              <w:t>30.4 / 11.0</w:t>
+              <w:t>34.4 / 11.0</w:t>
             </w:r>
           </w:p>
         </w:tc>
@@ -10094,7 +10128,7 @@
                 <w:i w:val="0"/>
                 <w:sz w:val="14"/>
               </w:rPr>
-              <w:t>10.1 / 8.8</w:t>
+              <w:t>25.6 / 8.8</w:t>
             </w:r>
           </w:p>
         </w:tc>
@@ -10245,7 +10279,7 @@
                 <w:i w:val="0"/>
                 <w:sz w:val="14"/>
               </w:rPr>
-              <w:t>6.3 / 16.0</w:t>
+              <w:t>18.2 / 16.0</w:t>
             </w:r>
           </w:p>
         </w:tc>
@@ -10313,7 +10347,7 @@
                 <w:i w:val="0"/>
                 <w:sz w:val="14"/>
               </w:rPr>
-              <w:t>BOTH — short of traffic and under target</w:t>
+              <w:t>TRAFFIC GAP — converts when shown, not shown/clicked enough</w:t>
             </w:r>
           </w:p>
         </w:tc>
@@ -10395,7 +10429,7 @@
                 <w:i w:val="0"/>
                 <w:sz w:val="14"/>
               </w:rPr>
-              <w:t>26.9 / 21.2</w:t>
+              <w:t>31.2 / 21.2</w:t>
             </w:r>
           </w:p>
         </w:tc>
@@ -10459,7 +10493,7 @@
                 <w:i w:val="0"/>
                 <w:sz w:val="14"/>
               </w:rPr>
-              <w:t>ON TRACK</w:t>
+              <w:t>MEETS THE BARS — impression share not read</w:t>
             </w:r>
           </w:p>
         </w:tc>
@@ -10546,7 +10580,7 @@
                 <w:i w:val="0"/>
                 <w:sz w:val="14"/>
               </w:rPr>
-              <w:t>15.7 / 12.5</w:t>
+              <w:t>24.1 / 12.5</w:t>
             </w:r>
           </w:p>
         </w:tc>
@@ -10830,7 +10864,7 @@
                 <w:i w:val="0"/>
                 <w:sz w:val="14"/>
               </w:rPr>
-              <w:t>18.4 / 2.1</w:t>
+              <w:t>— / 2.1</w:t>
             </w:r>
           </w:p>
         </w:tc>
@@ -10847,7 +10881,7 @@
                 <w:i w:val="0"/>
                 <w:sz w:val="14"/>
               </w:rPr>
-              <w:t>0.0 / 10.1</w:t>
+              <w:t>— / 10.1</w:t>
             </w:r>
           </w:p>
         </w:tc>
@@ -10956,7 +10990,7 @@
           <w:b w:val="0"/>
           <w:i w:val="0"/>
         </w:rPr>
-        <w:t>Every Bamboo group and every size-qualified Cooling group meets its CTR and CVR bars at top of search at low single-digit impression share — a traffic gap. Cooling (the broad group) is the exception on CVR, carried by the head term “cooling sheets”. The two in-focus groups: Bamboo|Cooling is a clean traffic gap on a real sample (92 top-of-search clicks, CVR 19.1% vs 7.5%); Bamboo|California King meets both bars on a thin sample (35 clicks) and is small in absolute terms — $298 in 30 days across the group.</w:t>
+        <w:t>Every Bamboo group and every size-qualified Cooling group meets its CTR and CVR bars at top of search at low single-digit impression share — a traffic gap. The broad Cooling group sits at its CVR bar (8.8% vs 8.7%), held down by its head term “cooling sheets” (7.5%). The two in-focus groups: Bamboo|Cooling is a clean traffic gap on a real sample (92 top-of-search clicks, CVR 21.4% vs 7.5%); Bamboo|California King meets both bars on a thin sample (35 clicks) and is small in absolute terms — $298 in 30 days across the group.</w:t>
       </w:r>
     </w:p>
     <w:p>
@@ -14740,7 +14774,7 @@
           <w:b w:val="0"/>
           <w:i w:val="0"/>
         </w:rPr>
-        <w:t xml:space="preserve"> — Already at 7–11 on the 7-day median with 2–4 top-of-search clicks in 30 days. The target (1–5) is a few positions away, and the push can buy it: grade on impression share and rank. “bamboo california king sheets” has had no top-of-search order on 15 clicks in 90 days — it takes no step until it converts.</w:t>
+        <w:t xml:space="preserve"> — Already at 7–11 on the 7-day median with 2–4 top-of-search clicks in 30 days. The target (1–5) is a few positions away, and the push can buy it: grade on impression share and rank. The Cal King group converts 8.4% at the top, so its loss stops sit near $7: “cal king bamboo sheet set” is already above its stop at $10.35 (15% share, no order on 9 clicks) and holds there. “bamboo california king sheets” has had no top-of-search order on 15 clicks — under the framework’s blend that is no evidence yet, so it prices on the Cal King group rate (8.4%) and steps like the rest.</w:t>
       </w:r>
     </w:p>
     <w:p>

</xml_diff>